<commit_message>
docs: adiciona diretrizes da Sprint 17 para Casos de Teste
Inclui estrutura obrigatória dos testes, cenários de validação, critérios de aceitação e checklist de Definition of Done.
</commit_message>
<xml_diff>
--- a/docs/Sprint 4 - Regra de negócio.docx
+++ b/docs/Sprint 4 - Regra de negócio.docx
@@ -891,14 +891,12 @@
         </w:rPr>
         <w:t xml:space="preserve"> </w:t>
       </w:r>
-      <w:proofErr w:type="spellStart"/>
       <w:r>
         <w:rPr>
           <w:rFonts w:ascii="Arial" w:hAnsi="Arial" w:cs="Arial"/>
         </w:rPr>
         <w:t>neurodivergência</w:t>
       </w:r>
-      <w:proofErr w:type="spellEnd"/>
       <w:r>
         <w:rPr>
           <w:rFonts w:ascii="Arial" w:hAnsi="Arial" w:cs="Arial"/>
@@ -1413,6 +1411,12 @@
         </w:rPr>
         <w:br/>
         <w:t>Veículo cadastrado com sucesso.</w:t>
+      </w:r>
+      <w:r>
+        <w:rPr>
+          <w:rFonts w:ascii="Arial" w:hAnsi="Arial" w:cs="Arial"/>
+        </w:rPr>
+        <w:t xml:space="preserve"> </w:t>
       </w:r>
     </w:p>
     <w:p>

</xml_diff>